<commit_message>
Added old glasses code
</commit_message>
<xml_diff>
--- a/Documents/ProductRequirements.docx
+++ b/Documents/ProductRequirements.docx
@@ -3025,7 +3025,7 @@
       <w:bookmarkEnd w:id="50"/>
       <w:r>
         <w:rPr/>
-        <w:t>2026 Vandal Football Schedule</w:t>
+        <w:t>2026 VMB Performance Schedule</w:t>
       </w:r>
     </w:p>
     <w:p>
@@ -3090,6 +3090,24 @@
         <w:tab/>
         <w:tab/>
         <w:t>Oct 24, 2026</w:t>
+      </w:r>
+    </w:p>
+    <w:p>
+      <w:pPr>
+        <w:pStyle w:val="Normal"/>
+        <w:numPr>
+          <w:ilvl w:val="0"/>
+          <w:numId w:val="17"/>
+        </w:numPr>
+        <w:rPr/>
+      </w:pPr>
+      <w:r>
+        <w:rPr/>
+        <w:t>Bands of America</w:t>
+        <w:tab/>
+        <w:tab/>
+        <w:tab/>
+        <w:t>Oct 31, 2026</w:t>
       </w:r>
     </w:p>
     <w:p>

</xml_diff>